<commit_message>
Cap nhat bao cao Bai 1, them bao cao Bai 2, so do mach, luu do
</commit_message>
<xml_diff>
--- a/BaoCao/BaoCao_Bai1_KTVXL.docx
+++ b/BaoCao/BaoCao_Bai1_KTVXL.docx
@@ -974,7 +974,7 @@
           <w:rPr>
             <w:b/>
           </w:rPr>
-          <w:t xml:space="preserve">8</w:t>
+          <w:t xml:space="preserve">9</w:t>
         </w:r>
         <w:r>
           <w:rPr>
@@ -1016,7 +1016,7 @@
         </w:r>
         <w:r>
           <w:rPr/>
-          <w:t xml:space="preserve">8</w:t>
+          <w:t xml:space="preserve">9</w:t>
         </w:r>
         <w:r>
           <w:rPr/>
@@ -1056,7 +1056,7 @@
         </w:r>
         <w:r>
           <w:rPr/>
-          <w:t xml:space="preserve">9</w:t>
+          <w:t xml:space="preserve">10</w:t>
         </w:r>
         <w:r>
           <w:rPr/>
@@ -1096,7 +1096,7 @@
         </w:r>
         <w:r>
           <w:rPr/>
-          <w:t xml:space="preserve">9</w:t>
+          <w:t xml:space="preserve">10</w:t>
         </w:r>
         <w:r>
           <w:rPr/>
@@ -1136,7 +1136,7 @@
         </w:r>
         <w:r>
           <w:rPr/>
-          <w:t xml:space="preserve">10</w:t>
+          <w:t xml:space="preserve">11</w:t>
         </w:r>
         <w:r>
           <w:rPr/>
@@ -1188,7 +1188,7 @@
           <w:rPr>
             <w:b/>
           </w:rPr>
-          <w:t xml:space="preserve">10</w:t>
+          <w:t xml:space="preserve">11</w:t>
         </w:r>
         <w:r>
           <w:rPr>
@@ -1230,7 +1230,7 @@
         </w:r>
         <w:r>
           <w:rPr/>
-          <w:t xml:space="preserve">10</w:t>
+          <w:t xml:space="preserve">11</w:t>
         </w:r>
         <w:r>
           <w:rPr/>
@@ -1270,7 +1270,7 @@
         </w:r>
         <w:r>
           <w:rPr/>
-          <w:t xml:space="preserve">10</w:t>
+          <w:t xml:space="preserve">11</w:t>
         </w:r>
         <w:r>
           <w:rPr/>
@@ -1310,7 +1310,7 @@
         </w:r>
         <w:r>
           <w:rPr/>
-          <w:t xml:space="preserve">11</w:t>
+          <w:t xml:space="preserve">12</w:t>
         </w:r>
         <w:r>
           <w:rPr/>
@@ -1390,7 +1390,7 @@
         </w:r>
         <w:r>
           <w:rPr/>
-          <w:t xml:space="preserve">12</w:t>
+          <w:t xml:space="preserve">13</w:t>
         </w:r>
         <w:r>
           <w:rPr/>
@@ -1442,7 +1442,7 @@
           <w:rPr>
             <w:b/>
           </w:rPr>
-          <w:t xml:space="preserve">12</w:t>
+          <w:t xml:space="preserve">13</w:t>
         </w:r>
         <w:r>
           <w:rPr>
@@ -1496,7 +1496,7 @@
           <w:rPr>
             <w:b/>
           </w:rPr>
-          <w:t xml:space="preserve">13</w:t>
+          <w:t xml:space="preserve">14</w:t>
         </w:r>
         <w:r>
           <w:rPr>
@@ -1538,7 +1538,7 @@
         </w:r>
         <w:r>
           <w:rPr/>
-          <w:t xml:space="preserve">13</w:t>
+          <w:t xml:space="preserve">14</w:t>
         </w:r>
         <w:r>
           <w:rPr/>
@@ -1578,7 +1578,7 @@
         </w:r>
         <w:r>
           <w:rPr/>
-          <w:t xml:space="preserve">13</w:t>
+          <w:t xml:space="preserve">14</w:t>
         </w:r>
         <w:r>
           <w:rPr/>
@@ -1878,7 +1878,7 @@
       <w:hyperlink w:anchor="_Cap0008" w:history="1">
         <w:r>
           <w:rPr/>
-          <w:t xml:space="preserve">Hình 6. Toàn bộ sơ đồ mạch Proteus (chụp màn hình đầy đủ khi chưa chạy, phóng to vừa trang)</w:t>
+          <w:t xml:space="preserve">Hình 6. Sơ đồ mạch mô phỏng trên Proteus</w:t>
         </w:r>
         <w:r>
           <w:rPr/>
@@ -1898,7 +1898,7 @@
         </w:r>
         <w:r>
           <w:rPr/>
-          <w:t xml:space="preserve">8</w:t>
+          <w:t xml:space="preserve">9</w:t>
         </w:r>
         <w:r>
           <w:rPr/>
@@ -1978,7 +1978,7 @@
         </w:r>
         <w:r>
           <w:rPr/>
-          <w:t xml:space="preserve">11</w:t>
+          <w:t xml:space="preserve">12</w:t>
         </w:r>
         <w:r>
           <w:rPr/>
@@ -2018,7 +2018,7 @@
         </w:r>
         <w:r>
           <w:rPr/>
-          <w:t xml:space="preserve">11</w:t>
+          <w:t xml:space="preserve">12</w:t>
         </w:r>
         <w:r>
           <w:rPr/>
@@ -2098,7 +2098,7 @@
         </w:r>
         <w:r>
           <w:rPr/>
-          <w:t xml:space="preserve">12</w:t>
+          <w:t xml:space="preserve">13</w:t>
         </w:r>
         <w:r>
           <w:rPr/>
@@ -2280,7 +2280,7 @@
         </w:r>
         <w:r>
           <w:rPr/>
-          <w:t xml:space="preserve">8</w:t>
+          <w:t xml:space="preserve">9</w:t>
         </w:r>
         <w:r>
           <w:rPr/>
@@ -2320,7 +2320,7 @@
         </w:r>
         <w:r>
           <w:rPr/>
-          <w:t xml:space="preserve">12</w:t>
+          <w:t xml:space="preserve">13</w:t>
         </w:r>
         <w:r>
           <w:rPr/>
@@ -5396,7 +5396,7 @@
               <w:rPr>
                 <w:sz w:val="23"/>
               </w:rPr>
-              <w:t>R 330 Ω → C → loa / PAM8403</w:t>
+              <w:t>R2 1 kΩ → C1 100 nF xuống GND → C2 10 µF → loa (mạch thật: qua PAM8403)</w:t>
             </w:r>
           </w:p>
         </w:tc>
@@ -5537,7 +5537,7 @@
               <w:rPr>
                 <w:sz w:val="23"/>
               </w:rPr>
-              <w:t>LED báo trạng thái</w:t>
+              <w:t>R3 330 Ω → LED D1 → 3,3 V (sáng khi PC13 = 0)</w:t>
             </w:r>
           </w:p>
         </w:tc>
@@ -5640,51 +5640,73 @@
           <w:b w:val="0"/>
           <w:i w:val="0"/>
         </w:rPr>
-        <w:t>Mạch mô phỏng gồm: U1 STM32F103C8, U2 DHT11, MMC1 thẻ nhớ (gắn file ảnh thẻ sdcard.img dung lượng 32 MB định dạng FAT16), Virtual Terminal nối USART1, nguồn tín hiệu MIC (file âm thanh mic_input.wav) đưa vào PA0, nút nhấn ở PB12/PB13 và loa LS1 nối PB6 qua R2, C2.</w:t>
+        <w:t>Mạch mô phỏng gồm: U1 STM32F103C8, U2 DHT11, MMC1 thẻ nhớ (gắn file ảnh thẻ sdcard.img dung lượng 32 MB định dạng FAT16), Virtual Terminal nối USART1, nguồn tín hiệu MIC (file âm thanh mic_input.wav) đưa vào PA0, nút nhấn ở PB12/PB13 nối GND, LED D1 nối PC13 qua R3 330 Ω và loa LS1 nối PB6 qua mạch lọc R2 = 1 kΩ, C1 = 100 nF, tụ ghép C2 = 10 µF. Các chân nguồn VDDA, VBAT nối 3,3 V; VSSA, BOOT0 nối GND.</w:t>
       </w:r>
     </w:p>
-    <w:tbl>
-      <w:tblPr>
-        <w:tblStyle w:val="TableGrid"/>
-        <w:tblW w:type="auto" w:w="0"/>
+    <w:p>
+      <w:pPr>
+        <w:jc w:val="both"/>
+      </w:pPr>
+      <w:r>
+        <w:rPr>
+          <w:b w:val="0"/>
+          <w:i w:val="0"/>
+        </w:rPr>
+        <w:t>Do thư viện Proteus không có mô hình MAX9814, tín hiệu micro được thay bằng nguồn âm thanh lấy từ file mic_input.wav (220 Hz, 8 kHz/8 bit) đưa vào PA0. Tương tự, trên mạch mô phỏng loa được nối trực tiếp sau mạch lọc; trên mạch thật cần thêm module khuếch đại PAM8403 vì chân vi điều khiển chỉ cấp được khoảng 20 mA.</w:t>
+      </w:r>
+    </w:p>
+    <w:p>
+      <w:pPr>
+        <w:jc w:val="both"/>
+      </w:pPr>
+      <w:r>
+        <w:rPr>
+          <w:b w:val="0"/>
+          <w:i w:val="0"/>
+        </w:rPr>
+        <w:t>Tần số cắt của mạch lọc thông thấp RC: fc = 1/(2π·R2·C1) = 1/(2π·1000·100·10⁻⁹) ≈ 1,6 kHz. Tần số này giữ lại dải giọng nói chủ yếu và loại bỏ hoàn toàn sóng mang PWM 250 kHz; tụ C2 chặn thành phần DC 1,65 V (mức giữa của PWM) để loa không bị lệch.</w:t>
+      </w:r>
+    </w:p>
+    <w:p>
+      <w:pPr>
+        <w:keepNext/>
         <w:jc w:val="center"/>
-        <w:tblLayout w:type="fixed"/>
-        <w:tblLook w:firstColumn="1" w:firstRow="1" w:lastColumn="0" w:lastRow="0" w:noHBand="0" w:noVBand="1" w:val="04A0"/>
-        <w:tblLayout w:type="fixed"/>
-      </w:tblPr>
-      <w:tblGrid>
-        <w:gridCol w:w="8505"/>
-      </w:tblGrid>
-      <w:tr>
-        <w:trPr>
-          <w:cantSplit/>
-          <w:tblHeader/>
-        </w:trPr>
-        <w:tc>
-          <w:tcPr>
-            <w:tcW w:type="dxa" w:w="8504"/>
-            <w:shd w:fill="FFF2CC"/>
-          </w:tcPr>
-          <w:p>
-            <w:pPr>
-              <w:jc w:val="center"/>
-            </w:pPr>
-            <w:r/>
-            <w:r>
-              <w:rPr>
-                <w:b/>
-                <w:color w:val="C00000"/>
-              </w:rPr>
-              <w:br/>
-              <w:t>[CHÈN ẢNH]</w:t>
-              <w:br/>
-              <w:t>Toàn bộ sơ đồ mạch Proteus (chụp màn hình đầy đủ khi chưa chạy, phóng to vừa trang)</w:t>
-              <w:br/>
-            </w:r>
-          </w:p>
-        </w:tc>
-      </w:tr>
-    </w:tbl>
+      </w:pPr>
+      <w:r>
+        <w:drawing>
+          <wp:inline xmlns:a="http://schemas.openxmlformats.org/drawingml/2006/main" xmlns:pic="http://schemas.openxmlformats.org/drawingml/2006/picture">
+            <wp:extent cx="5760000" cy="3908571"/>
+            <wp:docPr id="6" name="Picture 6"/>
+            <wp:cNvGraphicFramePr>
+              <a:graphicFrameLocks noChangeAspect="1"/>
+            </wp:cNvGraphicFramePr>
+            <a:graphic>
+              <a:graphicData uri="http://schemas.openxmlformats.org/drawingml/2006/picture">
+                <pic:pic>
+                  <pic:nvPicPr>
+                    <pic:cNvPr id="0" name="so_do_mach_proteus.png"/>
+                    <pic:cNvPicPr/>
+                  </pic:nvPicPr>
+                  <pic:blipFill>
+                    <a:blip r:embed="rId14"/>
+                    <a:stretch>
+                      <a:fillRect/>
+                    </a:stretch>
+                  </pic:blipFill>
+                  <pic:spPr>
+                    <a:xfrm>
+                      <a:off x="0" y="0"/>
+                      <a:ext cx="5760000" cy="3908571"/>
+                    </a:xfrm>
+                    <a:prstGeom prst="rect"/>
+                  </pic:spPr>
+                </pic:pic>
+              </a:graphicData>
+            </a:graphic>
+          </wp:inline>
+        </w:drawing>
+      </w:r>
+    </w:p>
     <w:p>
       <w:pPr>
         <w:pStyle w:val="Caption"/>
@@ -5759,7 +5781,7 @@
           <w:color w:val="000000"/>
           <w:sz w:val="24"/>
         </w:rPr>
-        <w:t>. Toàn bộ sơ đồ mạch Proteus (chụp màn hình đầy đủ khi chưa chạy, phóng to vừa trang)</w:t>
+        <w:t>. Sơ đồ mạch mô phỏng trên Proteus</w:t>
       </w:r>
       <w:bookmarkEnd w:id="24"/>
     </w:p>
@@ -6438,8 +6460,8 @@
       <w:r>
         <w:drawing>
           <wp:inline xmlns:a="http://schemas.openxmlformats.org/drawingml/2006/main" xmlns:pic="http://schemas.openxmlformats.org/drawingml/2006/picture">
-            <wp:extent cx="5760000" cy="3597748"/>
-            <wp:docPr id="6" name="Picture 6"/>
+            <wp:extent cx="5760000" cy="3908571"/>
+            <wp:docPr id="7" name="Picture 7"/>
             <wp:cNvGraphicFramePr>
               <a:graphicFrameLocks noChangeAspect="1"/>
             </wp:cNvGraphicFramePr>
@@ -6447,7 +6469,7 @@
               <a:graphicData uri="http://schemas.openxmlformats.org/drawingml/2006/picture">
                 <pic:pic>
                   <pic:nvPicPr>
-                    <pic:cNvPr id="0" name="image-1.png"/>
+                    <pic:cNvPr id="0" name="so_do_mach_proteus.png"/>
                     <pic:cNvPicPr/>
                   </pic:nvPicPr>
                   <pic:blipFill>
@@ -6459,7 +6481,7 @@
                   <pic:spPr>
                     <a:xfrm>
                       <a:off x="0" y="0"/>
-                      <a:ext cx="5760000" cy="3597748"/>
+                      <a:ext cx="5760000" cy="3908571"/>
                     </a:xfrm>
                     <a:prstGeom prst="rect"/>
                   </pic:spPr>

</xml_diff>